<commit_message>
testing the ci/cd by deleting line  pour le rapport
</commit_message>
<xml_diff>
--- a/Doc_projet_Azure.docx
+++ b/Doc_projet_Azure.docx
@@ -47,11 +47,6 @@
       <w:proofErr w:type="spellEnd"/>
     </w:p>
     <w:p>
-      <w:pPr>
-        <w:rPr>
-          <w:lang w:val="en-GB"/>
-        </w:rPr>
-      </w:pPr>
       <w:r>
         <w:rPr>
           <w:b/>
@@ -73,84 +68,17 @@
         <w:br/>
       </w:r>
       <w:r>
-        <w:rPr>
-          <w:lang w:val="en-GB"/>
-        </w:rPr>
-        <w:t>CISSE</w:t>
-      </w:r>
-      <w:r>
-        <w:rPr>
-          <w:lang w:val="en-GB"/>
-        </w:rPr>
-        <w:t xml:space="preserve"> </w:t>
-      </w:r>
-      <w:r>
-        <w:rPr>
-          <w:lang w:val="en-GB"/>
-        </w:rPr>
-        <w:t>Cheikh Ahmadou</w:t>
-      </w:r>
-      <w:r>
-        <w:rPr>
-          <w:lang w:val="en-GB"/>
-        </w:rPr>
-        <w:t xml:space="preserve"> Bamba</w:t>
-      </w:r>
-    </w:p>
-    <w:p>
-      <w:pPr>
-        <w:rPr>
-          <w:lang w:val="en-GB"/>
-        </w:rPr>
-      </w:pPr>
-      <w:r>
-        <w:rPr>
-          <w:lang w:val="en-GB"/>
-        </w:rPr>
-        <w:t>BARRY</w:t>
-      </w:r>
-      <w:r>
-        <w:rPr>
-          <w:lang w:val="en-GB"/>
-        </w:rPr>
-        <w:t xml:space="preserve"> </w:t>
-      </w:r>
-      <w:r>
-        <w:rPr>
-          <w:lang w:val="en-GB"/>
-        </w:rPr>
-        <w:t>Oumar</w:t>
-      </w:r>
-      <w:r>
-        <w:rPr>
-          <w:lang w:val="en-GB"/>
-        </w:rPr>
-        <w:t xml:space="preserve"> </w:t>
-      </w:r>
-    </w:p>
-    <w:p>
-      <w:pPr>
-        <w:rPr>
-          <w:lang w:val="en-GB"/>
-        </w:rPr>
-      </w:pPr>
-      <w:r>
-        <w:rPr>
-          <w:lang w:val="en-GB"/>
-        </w:rPr>
-        <w:t>MIELCZAREK</w:t>
-      </w:r>
-      <w:r>
-        <w:rPr>
-          <w:lang w:val="en-GB"/>
-        </w:rPr>
-        <w:t xml:space="preserve"> </w:t>
-      </w:r>
-      <w:r>
-        <w:rPr>
-          <w:lang w:val="en-GB"/>
-        </w:rPr>
-        <w:t>Jakub</w:t>
+        <w:t>CISSE Cheikh Ahmadou Bamba</w:t>
+      </w:r>
+    </w:p>
+    <w:p>
+      <w:r>
+        <w:t xml:space="preserve">BARRY Oumar </w:t>
+      </w:r>
+    </w:p>
+    <w:p>
+      <w:r>
+        <w:t>MIELCZAREK Jakub</w:t>
       </w:r>
     </w:p>
     <w:p>
@@ -257,17 +185,7 @@
           <w:szCs w:val="32"/>
           <w:u w:val="single"/>
         </w:rPr>
-        <w:t xml:space="preserve"> </w:t>
-      </w:r>
-      <w:r>
-        <w:rPr>
-          <w:b/>
-          <w:bCs/>
-          <w:sz w:val="32"/>
-          <w:szCs w:val="32"/>
-          <w:u w:val="single"/>
-        </w:rPr>
-        <w:t>Architecture du projet</w:t>
+        <w:t xml:space="preserve"> Architecture du projet</w:t>
       </w:r>
     </w:p>
     <w:p>
@@ -458,16 +376,7 @@
           <w:sz w:val="32"/>
           <w:szCs w:val="32"/>
         </w:rPr>
-        <w:t xml:space="preserve"> </w:t>
-      </w:r>
-      <w:r>
-        <w:rPr>
-          <w:b/>
-          <w:bCs/>
-          <w:sz w:val="32"/>
-          <w:szCs w:val="32"/>
-        </w:rPr>
-        <w:t>Azure</w:t>
+        <w:t xml:space="preserve"> Azure</w:t>
       </w:r>
     </w:p>
     <w:p>
@@ -725,6 +634,9 @@
     </w:p>
     <w:p>
       <w:r>
+        <w:rPr>
+          <w:noProof/>
+        </w:rPr>
         <w:drawing>
           <wp:inline distT="0" distB="0" distL="0" distR="0" wp14:anchorId="49E06EF5" wp14:editId="6C61AC74">
             <wp:extent cx="5760720" cy="3049905"/>
@@ -764,6 +676,9 @@
     </w:p>
     <w:p>
       <w:r>
+        <w:rPr>
+          <w:noProof/>
+        </w:rPr>
         <w:lastRenderedPageBreak/>
         <w:drawing>
           <wp:inline distT="0" distB="0" distL="0" distR="0" wp14:anchorId="62C5DCB0" wp14:editId="1B0DB573">
@@ -939,6 +854,9 @@
     </w:p>
     <w:p>
       <w:r>
+        <w:rPr>
+          <w:noProof/>
+        </w:rPr>
         <w:lastRenderedPageBreak/>
         <w:drawing>
           <wp:inline distT="0" distB="0" distL="0" distR="0" wp14:anchorId="61295897" wp14:editId="5013F5A6">
@@ -979,6 +897,9 @@
     </w:p>
     <w:p>
       <w:r>
+        <w:rPr>
+          <w:noProof/>
+        </w:rPr>
         <w:drawing>
           <wp:inline distT="0" distB="0" distL="0" distR="0" wp14:anchorId="46627D2E" wp14:editId="2DD908FD">
             <wp:extent cx="5760720" cy="3041650"/>
@@ -1063,9 +984,16 @@
         <w:rPr>
           <w:b/>
           <w:bCs/>
+        </w:rPr>
+        <w:t xml:space="preserve"> </w:t>
+      </w:r>
+      <w:r>
+        <w:rPr>
+          <w:b/>
+          <w:bCs/>
           <w:lang w:val="en-GB"/>
         </w:rPr>
-        <w:t xml:space="preserve"> Azure Database for PostgreSQL (Flexible Server)</w:t>
+        <w:t>Azure Database for PostgreSQL (Flexible Server)</w:t>
       </w:r>
     </w:p>
     <w:p>
@@ -1387,8 +1315,9 @@
           <w14:ligatures w14:val="none"/>
         </w:rPr>
         <w:br/>
-        <w:t xml:space="preserve">Pour éviter toute exposition de ces informations sensibles, celles-ci ne sont jamais accessibles directement dans le code ou les fichiers de </w:t>
-      </w:r>
+        <w:t xml:space="preserve">Pour éviter toute exposition de ces informations sensibles, celles-ci ne sont jamais accessibles directement dans le code ou les fichiers de configuration. L’accès aux secrets est assuré grâce </w:t>
+      </w:r>
+      <w:proofErr w:type="gramStart"/>
       <w:r>
         <w:rPr>
           <w:rFonts w:eastAsia="Times New Roman" w:cs="Times New Roman"/>
@@ -1396,7 +1325,30 @@
           <w:lang w:eastAsia="fr-FR"/>
           <w14:ligatures w14:val="none"/>
         </w:rPr>
-        <w:t>configuration. L’accès</w:t>
+        <w:t xml:space="preserve">au </w:t>
+      </w:r>
+      <w:r>
+        <w:rPr>
+          <w:rFonts w:eastAsia="Times New Roman" w:cs="Times New Roman"/>
+          <w:b/>
+          <w:bCs/>
+          <w:kern w:val="0"/>
+          <w:lang w:eastAsia="fr-FR"/>
+          <w14:ligatures w14:val="none"/>
+        </w:rPr>
+        <w:t>Azure</w:t>
+      </w:r>
+      <w:proofErr w:type="gramEnd"/>
+      <w:r>
+        <w:rPr>
+          <w:rFonts w:eastAsia="Times New Roman" w:cs="Times New Roman"/>
+          <w:b/>
+          <w:bCs/>
+          <w:kern w:val="0"/>
+          <w:lang w:eastAsia="fr-FR"/>
+          <w14:ligatures w14:val="none"/>
+        </w:rPr>
+        <w:t xml:space="preserve"> Key Vault Provider for Secrets Store CSI Driver</w:t>
       </w:r>
       <w:r>
         <w:rPr>
@@ -1405,9 +1357,19 @@
           <w:lang w:eastAsia="fr-FR"/>
           <w14:ligatures w14:val="none"/>
         </w:rPr>
-        <w:t xml:space="preserve"> aux secrets est assuré grâce </w:t>
-      </w:r>
-      <w:proofErr w:type="gramStart"/>
+        <w:t xml:space="preserve">, intégré au cluster </w:t>
+      </w:r>
+      <w:r>
+        <w:rPr>
+          <w:rFonts w:eastAsia="Times New Roman" w:cs="Times New Roman"/>
+          <w:b/>
+          <w:bCs/>
+          <w:kern w:val="0"/>
+          <w:lang w:eastAsia="fr-FR"/>
+          <w14:ligatures w14:val="none"/>
+        </w:rPr>
+        <w:t>AKS</w:t>
+      </w:r>
       <w:r>
         <w:rPr>
           <w:rFonts w:eastAsia="Times New Roman" w:cs="Times New Roman"/>
@@ -1415,31 +1377,9 @@
           <w:lang w:eastAsia="fr-FR"/>
           <w14:ligatures w14:val="none"/>
         </w:rPr>
-        <w:t xml:space="preserve">au </w:t>
-      </w:r>
-      <w:r>
-        <w:rPr>
-          <w:rFonts w:eastAsia="Times New Roman" w:cs="Times New Roman"/>
-          <w:b/>
-          <w:bCs/>
-          <w:kern w:val="0"/>
-          <w:lang w:eastAsia="fr-FR"/>
-          <w14:ligatures w14:val="none"/>
-        </w:rPr>
-        <w:t>Azure</w:t>
-      </w:r>
-      <w:proofErr w:type="gramEnd"/>
-      <w:r>
-        <w:rPr>
-          <w:rFonts w:eastAsia="Times New Roman" w:cs="Times New Roman"/>
-          <w:b/>
-          <w:bCs/>
-          <w:kern w:val="0"/>
-          <w:lang w:eastAsia="fr-FR"/>
-          <w14:ligatures w14:val="none"/>
-        </w:rPr>
-        <w:t xml:space="preserve"> Key Vault Provider for Secrets Store CSI Driver</w:t>
-      </w:r>
+        <w:t xml:space="preserve">. Ce mécanisme permet d’injecter dynamiquement les secrets dans les </w:t>
+      </w:r>
+      <w:proofErr w:type="spellStart"/>
       <w:r>
         <w:rPr>
           <w:rFonts w:eastAsia="Times New Roman" w:cs="Times New Roman"/>
@@ -1447,19 +1387,9 @@
           <w:lang w:eastAsia="fr-FR"/>
           <w14:ligatures w14:val="none"/>
         </w:rPr>
-        <w:t xml:space="preserve">, intégré au cluster </w:t>
-      </w:r>
-      <w:r>
-        <w:rPr>
-          <w:rFonts w:eastAsia="Times New Roman" w:cs="Times New Roman"/>
-          <w:b/>
-          <w:bCs/>
-          <w:kern w:val="0"/>
-          <w:lang w:eastAsia="fr-FR"/>
-          <w14:ligatures w14:val="none"/>
-        </w:rPr>
-        <w:t>AKS</w:t>
-      </w:r>
+        <w:t>pods</w:t>
+      </w:r>
+      <w:proofErr w:type="spellEnd"/>
       <w:r>
         <w:rPr>
           <w:rFonts w:eastAsia="Times New Roman" w:cs="Times New Roman"/>
@@ -1467,7 +1397,7 @@
           <w:lang w:eastAsia="fr-FR"/>
           <w14:ligatures w14:val="none"/>
         </w:rPr>
-        <w:t xml:space="preserve">. Ce mécanisme permet d’injecter dynamiquement les secrets dans les </w:t>
+        <w:t xml:space="preserve"> </w:t>
       </w:r>
       <w:proofErr w:type="spellStart"/>
       <w:r>
@@ -1477,7 +1407,7 @@
           <w:lang w:eastAsia="fr-FR"/>
           <w14:ligatures w14:val="none"/>
         </w:rPr>
-        <w:t>pods</w:t>
+        <w:t>Kubernetes</w:t>
       </w:r>
       <w:proofErr w:type="spellEnd"/>
       <w:r>
@@ -1487,9 +1417,8 @@
           <w:lang w:eastAsia="fr-FR"/>
           <w14:ligatures w14:val="none"/>
         </w:rPr>
-        <w:t xml:space="preserve"> </w:t>
-      </w:r>
-      <w:proofErr w:type="spellStart"/>
+        <w:t>, soit sous forme de fichiers montés, soit sous forme de variables d’environnement.</w:t>
+      </w:r>
       <w:r>
         <w:rPr>
           <w:rFonts w:eastAsia="Times New Roman" w:cs="Times New Roman"/>
@@ -1497,9 +1426,8 @@
           <w:lang w:eastAsia="fr-FR"/>
           <w14:ligatures w14:val="none"/>
         </w:rPr>
-        <w:t>Kubernetes</w:t>
-      </w:r>
-      <w:proofErr w:type="spellEnd"/>
+        <w:t xml:space="preserve">   </w:t>
+      </w:r>
       <w:r>
         <w:rPr>
           <w:rFonts w:eastAsia="Times New Roman" w:cs="Times New Roman"/>
@@ -1507,7 +1435,31 @@
           <w:lang w:eastAsia="fr-FR"/>
           <w14:ligatures w14:val="none"/>
         </w:rPr>
-        <w:t>, soit sous forme de fichiers montés, soit sous forme de variables d’environnement.</w:t>
+        <w:t xml:space="preserve">Une </w:t>
+      </w:r>
+      <w:proofErr w:type="spellStart"/>
+      <w:r>
+        <w:rPr>
+          <w:rFonts w:eastAsia="Times New Roman" w:cs="Times New Roman"/>
+          <w:b/>
+          <w:bCs/>
+          <w:kern w:val="0"/>
+          <w:lang w:eastAsia="fr-FR"/>
+          <w14:ligatures w14:val="none"/>
+        </w:rPr>
+        <w:t>Managed</w:t>
+      </w:r>
+      <w:proofErr w:type="spellEnd"/>
+      <w:r>
+        <w:rPr>
+          <w:rFonts w:eastAsia="Times New Roman" w:cs="Times New Roman"/>
+          <w:b/>
+          <w:bCs/>
+          <w:kern w:val="0"/>
+          <w:lang w:eastAsia="fr-FR"/>
+          <w14:ligatures w14:val="none"/>
+        </w:rPr>
+        <w:t xml:space="preserve"> Identity</w:t>
       </w:r>
       <w:r>
         <w:rPr>
@@ -1516,8 +1468,9 @@
           <w:lang w:eastAsia="fr-FR"/>
           <w14:ligatures w14:val="none"/>
         </w:rPr>
-        <w:t xml:space="preserve">   </w:t>
-      </w:r>
+        <w:t xml:space="preserve"> est utilisée pour authentifier le </w:t>
+      </w:r>
+      <w:proofErr w:type="spellStart"/>
       <w:r>
         <w:rPr>
           <w:rFonts w:eastAsia="Times New Roman" w:cs="Times New Roman"/>
@@ -1525,32 +1478,9 @@
           <w:lang w:eastAsia="fr-FR"/>
           <w14:ligatures w14:val="none"/>
         </w:rPr>
-        <w:t xml:space="preserve">Une </w:t>
-      </w:r>
-      <w:proofErr w:type="spellStart"/>
-      <w:r>
-        <w:rPr>
-          <w:rFonts w:eastAsia="Times New Roman" w:cs="Times New Roman"/>
-          <w:b/>
-          <w:bCs/>
-          <w:kern w:val="0"/>
-          <w:lang w:eastAsia="fr-FR"/>
-          <w14:ligatures w14:val="none"/>
-        </w:rPr>
-        <w:t>Managed</w:t>
-      </w:r>
-      <w:proofErr w:type="spellEnd"/>
-      <w:r>
-        <w:rPr>
-          <w:rFonts w:eastAsia="Times New Roman" w:cs="Times New Roman"/>
-          <w:b/>
-          <w:bCs/>
-          <w:kern w:val="0"/>
-          <w:lang w:eastAsia="fr-FR"/>
-          <w14:ligatures w14:val="none"/>
-        </w:rPr>
-        <w:t xml:space="preserve"> Identity</w:t>
-      </w:r>
+        <w:t>pod</w:t>
+      </w:r>
+      <w:proofErr w:type="spellEnd"/>
       <w:r>
         <w:rPr>
           <w:rFonts w:eastAsia="Times New Roman" w:cs="Times New Roman"/>
@@ -1558,45 +1488,7 @@
           <w:lang w:eastAsia="fr-FR"/>
           <w14:ligatures w14:val="none"/>
         </w:rPr>
-        <w:t xml:space="preserve"> est utilisée pour authentifier le </w:t>
-      </w:r>
-      <w:proofErr w:type="spellStart"/>
-      <w:r>
-        <w:rPr>
-          <w:rFonts w:eastAsia="Times New Roman" w:cs="Times New Roman"/>
-          <w:kern w:val="0"/>
-          <w:lang w:eastAsia="fr-FR"/>
-          <w14:ligatures w14:val="none"/>
-        </w:rPr>
-        <w:t>pod</w:t>
-      </w:r>
-      <w:proofErr w:type="spellEnd"/>
-      <w:r>
-        <w:rPr>
-          <w:rFonts w:eastAsia="Times New Roman" w:cs="Times New Roman"/>
-          <w:kern w:val="0"/>
-          <w:lang w:eastAsia="fr-FR"/>
-          <w14:ligatures w14:val="none"/>
-        </w:rPr>
-        <w:t xml:space="preserve"> auprès d’Azure Key Vault, garantissant ainsi un accès sécurisé sans nécessiter de stockage d’identifiants dans l’</w:t>
-      </w:r>
-      <w:r>
-        <w:rPr>
-          <w:rFonts w:eastAsia="Times New Roman" w:cs="Times New Roman"/>
-          <w:kern w:val="0"/>
-          <w:lang w:eastAsia="fr-FR"/>
-          <w14:ligatures w14:val="none"/>
-        </w:rPr>
-        <w:t>application. Cette</w:t>
-      </w:r>
-      <w:r>
-        <w:rPr>
-          <w:rFonts w:eastAsia="Times New Roman" w:cs="Times New Roman"/>
-          <w:kern w:val="0"/>
-          <w:lang w:eastAsia="fr-FR"/>
-          <w14:ligatures w14:val="none"/>
-        </w:rPr>
-        <w:t xml:space="preserve"> approche permet à l’API d’accéder aux informations sensibles (comme les chaînes de connexion ou mots de passe) de manière sécurisée, sans jamais les exposer publiquement.</w:t>
+        <w:t xml:space="preserve"> auprès d’Azure Key Vault, garantissant ainsi un accès sécurisé sans nécessiter de stockage d’identifiants dans l’application. Cette approche permet à l’API d’accéder aux informations sensibles (comme les chaînes de connexion ou mots de passe) de manière sécurisée, sans jamais les exposer publiquement.</w:t>
       </w:r>
     </w:p>
     <w:p>
@@ -1613,6 +1505,7 @@
         <w:rPr>
           <w:b/>
           <w:bCs/>
+          <w:noProof/>
           <w:sz w:val="32"/>
           <w:szCs w:val="32"/>
           <w:u w:val="single"/>
@@ -2207,6 +2100,9 @@
     <w:p/>
     <w:p>
       <w:r>
+        <w:rPr>
+          <w:noProof/>
+        </w:rPr>
         <w:drawing>
           <wp:inline distT="0" distB="0" distL="0" distR="0" wp14:anchorId="70B2D47F" wp14:editId="3BC313DB">
             <wp:extent cx="5760720" cy="3090545"/>
@@ -2602,6 +2498,9 @@
     </w:p>
     <w:p>
       <w:r>
+        <w:rPr>
+          <w:noProof/>
+        </w:rPr>
         <w:drawing>
           <wp:inline distT="0" distB="0" distL="0" distR="0" wp14:anchorId="78C33D15" wp14:editId="46A5E22B">
             <wp:extent cx="5760720" cy="3077210"/>
@@ -2641,6 +2540,9 @@
     </w:p>
     <w:p>
       <w:r>
+        <w:rPr>
+          <w:noProof/>
+        </w:rPr>
         <w:lastRenderedPageBreak/>
         <w:drawing>
           <wp:inline distT="0" distB="0" distL="0" distR="0" wp14:anchorId="070C1808" wp14:editId="4CF2938D">
@@ -2681,6 +2583,9 @@
     </w:p>
     <w:p>
       <w:r>
+        <w:rPr>
+          <w:noProof/>
+        </w:rPr>
         <w:drawing>
           <wp:inline distT="0" distB="0" distL="0" distR="0" wp14:anchorId="03098018" wp14:editId="1CEC7242">
             <wp:extent cx="5760720" cy="3145790"/>
@@ -2818,10 +2723,7 @@
         <w:t xml:space="preserve"> DNS</w:t>
       </w:r>
       <w:r>
-        <w:t xml:space="preserve"> a</w:t>
-      </w:r>
-      <w:r>
-        <w:t xml:space="preserve"> été ajouté</w:t>
+        <w:t xml:space="preserve"> a été ajouté</w:t>
       </w:r>
     </w:p>
     <w:p>
@@ -2867,6 +2769,9 @@
     </w:p>
     <w:p>
       <w:r>
+        <w:rPr>
+          <w:noProof/>
+        </w:rPr>
         <w:drawing>
           <wp:inline distT="0" distB="0" distL="0" distR="0" wp14:anchorId="63D40036" wp14:editId="0771C9F3">
             <wp:extent cx="5760720" cy="3054350"/>
@@ -2906,6 +2811,9 @@
     </w:p>
     <w:p>
       <w:r>
+        <w:rPr>
+          <w:noProof/>
+        </w:rPr>
         <w:drawing>
           <wp:inline distT="0" distB="0" distL="0" distR="0" wp14:anchorId="0BAC89A2" wp14:editId="0C60DF07">
             <wp:extent cx="5760720" cy="3205480"/>
@@ -3111,6 +3019,172 @@
         <w:t>rollout</w:t>
       </w:r>
       <w:proofErr w:type="spellEnd"/>
+    </w:p>
+    <w:p/>
+    <w:p>
+      <w:r>
+        <w:rPr>
+          <w:noProof/>
+        </w:rPr>
+        <w:drawing>
+          <wp:inline distT="0" distB="0" distL="0" distR="0" wp14:anchorId="22ED492E" wp14:editId="712D3BE1">
+            <wp:extent cx="5760720" cy="3063240"/>
+            <wp:effectExtent l="0" t="0" r="0" b="3810"/>
+            <wp:docPr id="1511591343" name="Picture 1"/>
+            <wp:cNvGraphicFramePr>
+              <a:graphicFrameLocks xmlns:a="http://schemas.openxmlformats.org/drawingml/2006/main" noChangeAspect="1"/>
+            </wp:cNvGraphicFramePr>
+            <a:graphic xmlns:a="http://schemas.openxmlformats.org/drawingml/2006/main">
+              <a:graphicData uri="http://schemas.openxmlformats.org/drawingml/2006/picture">
+                <pic:pic xmlns:pic="http://schemas.openxmlformats.org/drawingml/2006/picture">
+                  <pic:nvPicPr>
+                    <pic:cNvPr id="1511591343" name=""/>
+                    <pic:cNvPicPr/>
+                  </pic:nvPicPr>
+                  <pic:blipFill>
+                    <a:blip r:embed="rId16"/>
+                    <a:stretch>
+                      <a:fillRect/>
+                    </a:stretch>
+                  </pic:blipFill>
+                  <pic:spPr>
+                    <a:xfrm>
+                      <a:off x="0" y="0"/>
+                      <a:ext cx="5760720" cy="3063240"/>
+                    </a:xfrm>
+                    <a:prstGeom prst="rect">
+                      <a:avLst/>
+                    </a:prstGeom>
+                  </pic:spPr>
+                </pic:pic>
+              </a:graphicData>
+            </a:graphic>
+          </wp:inline>
+        </w:drawing>
+      </w:r>
+    </w:p>
+    <w:p>
+      <w:r>
+        <w:rPr>
+          <w:noProof/>
+        </w:rPr>
+        <w:lastRenderedPageBreak/>
+        <w:drawing>
+          <wp:inline distT="0" distB="0" distL="0" distR="0" wp14:anchorId="41192A7C" wp14:editId="3E5DB44F">
+            <wp:extent cx="5760720" cy="3219450"/>
+            <wp:effectExtent l="0" t="0" r="0" b="0"/>
+            <wp:docPr id="132333588" name="Picture 1"/>
+            <wp:cNvGraphicFramePr>
+              <a:graphicFrameLocks xmlns:a="http://schemas.openxmlformats.org/drawingml/2006/main" noChangeAspect="1"/>
+            </wp:cNvGraphicFramePr>
+            <a:graphic xmlns:a="http://schemas.openxmlformats.org/drawingml/2006/main">
+              <a:graphicData uri="http://schemas.openxmlformats.org/drawingml/2006/picture">
+                <pic:pic xmlns:pic="http://schemas.openxmlformats.org/drawingml/2006/picture">
+                  <pic:nvPicPr>
+                    <pic:cNvPr id="132333588" name=""/>
+                    <pic:cNvPicPr/>
+                  </pic:nvPicPr>
+                  <pic:blipFill>
+                    <a:blip r:embed="rId17"/>
+                    <a:stretch>
+                      <a:fillRect/>
+                    </a:stretch>
+                  </pic:blipFill>
+                  <pic:spPr>
+                    <a:xfrm>
+                      <a:off x="0" y="0"/>
+                      <a:ext cx="5760720" cy="3219450"/>
+                    </a:xfrm>
+                    <a:prstGeom prst="rect">
+                      <a:avLst/>
+                    </a:prstGeom>
+                  </pic:spPr>
+                </pic:pic>
+              </a:graphicData>
+            </a:graphic>
+          </wp:inline>
+        </w:drawing>
+      </w:r>
+    </w:p>
+    <w:p/>
+    <w:p>
+      <w:pPr>
+        <w:rPr>
+          <w:b/>
+          <w:bCs/>
+          <w:sz w:val="32"/>
+          <w:szCs w:val="32"/>
+          <w:u w:val="single"/>
+        </w:rPr>
+      </w:pPr>
+      <w:r>
+        <w:rPr>
+          <w:b/>
+          <w:bCs/>
+        </w:rPr>
+        <w:t xml:space="preserve">                                                                        </w:t>
+      </w:r>
+      <w:r>
+        <w:rPr>
+          <w:b/>
+          <w:bCs/>
+          <w:sz w:val="32"/>
+          <w:szCs w:val="32"/>
+          <w:u w:val="single"/>
+        </w:rPr>
+        <w:t>C</w:t>
+      </w:r>
+      <w:r>
+        <w:rPr>
+          <w:b/>
+          <w:bCs/>
+          <w:sz w:val="32"/>
+          <w:szCs w:val="32"/>
+          <w:u w:val="single"/>
+        </w:rPr>
+        <w:t>onclusion</w:t>
+      </w:r>
+    </w:p>
+    <w:p>
+      <w:r>
+        <w:t>Ce projet a permis de mettre en place une infrastructure complète de déploiement d’une application web sur Microsoft Azure en suivant les principes du cloud et du DevOps.</w:t>
+      </w:r>
+    </w:p>
+    <w:p>
+      <w:r>
+        <w:t xml:space="preserve">L’application a été conçue avec une architecture claire séparant le frontend, le backend et la base de données. Elle a été conteneurisée avec Docker, stockée dans Azure Container </w:t>
+      </w:r>
+      <w:proofErr w:type="spellStart"/>
+      <w:r>
+        <w:t>Registry</w:t>
+      </w:r>
+      <w:proofErr w:type="spellEnd"/>
+      <w:r>
+        <w:t xml:space="preserve">, puis déployée sur un cluster </w:t>
+      </w:r>
+      <w:proofErr w:type="spellStart"/>
+      <w:r>
+        <w:t>Kubernetes</w:t>
+      </w:r>
+      <w:proofErr w:type="spellEnd"/>
+      <w:r>
+        <w:t xml:space="preserve"> (AKS).</w:t>
+      </w:r>
+    </w:p>
+    <w:p>
+      <w:r>
+        <w:t>La gestion des données sensibles a été sécurisée grâce à Azure Key Vault, et l’accès à l’application a été simplifié via un nom de domaine configuré avec Azure DNS.</w:t>
+      </w:r>
+    </w:p>
+    <w:p>
+      <w:r>
+        <w:t>Enfin, la mise en place d’un pipeline CI/CD avec GitHub Actions a permis d’automatiser le déploiement, rendant l’ensemble du système plus fiable et plus proche des pratiques professionnelles.</w:t>
+      </w:r>
+    </w:p>
+    <w:p>
+      <w:r>
+        <w:t>Ce projet illustre ainsi la mise en œuvre d’une architecture moderne, scalable et sécurisée dans un environnement cloud</w:t>
+      </w:r>
     </w:p>
     <w:p/>
     <w:sectPr>

</xml_diff>